<commit_message>
First update of new branch
</commit_message>
<xml_diff>
--- a/docs/GUIA_DE_TAGS_PADRONIZA.docx
+++ b/docs/GUIA_DE_TAGS_PADRONIZA.docx
@@ -115,7 +115,7 @@
           <w:i/>
           <w:color w:val="5A6976"/>
         </w:rPr>
-        <w:t>Versão de referência para o editor Campos e seções, grupos de escolha, grades do documento, tabelas de registros e tabelas repetíveis.</w:t>
+        <w:t>Versão de referência para o editor Campos e seções, grupos de escolha, tabelas de responsáveis e tabelas repetíveis.</w:t>
       </w:r>
     </w:p>
     <w:p>
@@ -315,7 +315,7 @@
               <w:t xml:space="preserve">Localize os campos — </w:t>
             </w:r>
             <w:r>
-              <w:t>Use Ferramentas DOCX &gt; Localizar campos. O aplicativo identifica tags, rótulos, seções e estruturas de tabela.</w:t>
+              <w:t>Clique em Localizar campos. O aplicativo analisa tags, controles do Word/PDF, tabelas, opções e áreas sem tags em uma única etapa; sugestões ambíguas continuam sujeitas à revisão.</w:t>
             </w:r>
           </w:p>
         </w:tc>
@@ -1521,12 +1521,12 @@
         <w:pStyle w:val="Heading1"/>
       </w:pPr>
       <w:r>
-        <w:t>6. Grades de formulário e tabelas de registros</w:t>
+        <w:t>6. Tabelas de campos fixos</w:t>
       </w:r>
     </w:p>
     <w:p>
       <w:r>
-        <w:t>O Word usa tabelas tanto para alinhar formulários quanto para representar registros. O Padroniza diferencia automaticamente as duas estruturas.</w:t>
+        <w:t>Para responsáveis, fiscais ou assinaturas com colunas repetidas, use tags normais em uma tabela do Word. Não use repeat: quando a quantidade de linhas é fixa.</w:t>
       </w:r>
     </w:p>
     <w:tbl>
@@ -1960,7 +1960,7 @@
     <w:p/>
     <w:p>
       <w:r>
-        <w:t>Use Grade do documento quando cada célula contém seu próprio rótulo e campo, como Setor, Responsável, Matrícula, E-mail e Telefone. Células mescladas mantêm a largura visual e textos sem tags, como o nome do órgão, aparecem como informação somente leitura. Use Tabela de registros quando existe um cabeçalho e várias linhas alinhadas, como Função, Nome, Matrícula, Setor e Ciência.</w:t>
+        <w:t>O analisador usa a primeira coluna como rótulo da linha e o cabeçalho como rótulo das colunas. Na prévia, os campos aparecem na mesma estrutura: uma linha por função e uma coluna por informação.</w:t>
       </w:r>
     </w:p>
     <w:tbl>
@@ -1987,9 +1987,15 @@
           </w:tcPr>
           <w:p>
             <w:r>
+              <w:rPr>
+                <w:b/>
+                <w:color w:val="1D5F91"/>
+              </w:rPr>
               <w:t>Ajuste manual</w:t>
               <w:br/>
-              <w:t>Em Grade do documento, campos da mesma linha do Word compartilham a Chave da linha; Início da coluna, Largura da célula e Total de colunas preservam a mesclagem. Em Tabela de registros, campos da mesma pessoa compartilham a Chave da linha e usam rótulos de coluna como Nome, Matrícula, Setor e Ciência.</w:t>
+            </w:r>
+            <w:r>
+              <w:t>Em Layout &gt; Detalhes, campos da mesma tabela devem compartilhar o Grupo do layout. Campos do mesmo responsável compartilham a Chave da linha; Nome, Matrícula, Setor e Ciência usam colunas diferentes.</w:t>
             </w:r>
           </w:p>
         </w:tc>
@@ -2675,7 +2681,13 @@
           </w:tcPr>
           <w:p>
             <w:r>
-              <w:t>Automático / Grade / Largura total / Escolha / Grade do documento / Tabela de registros</w:t>
+              <w:rPr>
+                <w:rFonts w:ascii="Consolas" w:hAnsi="Consolas"/>
+                <w:color w:val="1E4664"/>
+                <w:sz w:val="19"/>
+                <w:shd w:fill="EEF4F8"/>
+              </w:rPr>
+              <w:t>Automático / Grade / Largura total / Escolha / Tabela</w:t>
             </w:r>
           </w:p>
         </w:tc>
@@ -2691,7 +2703,7 @@
           </w:tcPr>
           <w:p>
             <w:r>
-              <w:t>Define a posição, as células mescladas e o agrupamento visual.</w:t>
+              <w:t>Define a posição e o agrupamento visual.</w:t>
             </w:r>
           </w:p>
         </w:tc>
@@ -2713,7 +2725,7 @@
     </w:p>
     <w:p>
       <w:r>
-        <w:t>A árvore resume a ordem do formulário e mostra subgrupos de escolha, Grade do documento e Tabela de registros. Use Nova seção, Renomear seção e Atribuir seleção à seção para reorganizar campos sem alterar as tags do DOCX.</w:t>
+        <w:t>A árvore resume a ordem do formulário e mostra subgrupos de escolha e tabela. Use Nova seção, Renomear seção e Atribuir seleção à seção para reorganizar campos sem alterar as tags do DOCX.</w:t>
       </w:r>
     </w:p>
     <w:p>
@@ -2726,7 +2738,7 @@
     </w:p>
     <w:p>
       <w:r>
-        <w:t>Revise a organização antes de salvar: seções recolhíveis, opções exclusivas em caixas clicáveis, campos em grade, campos de largura total, grades preservadas do Word e tabelas de registros. A prévia não altera o DOCX e não salva dados.</w:t>
+        <w:t>Revise a organização antes de salvar: seções recolhíveis, opções exclusivas em caixas clicáveis, campos em grade, campos de largura total e tabelas. A prévia não altera o DOCX e não salva dados.</w:t>
       </w:r>
     </w:p>
     <w:p>
@@ -3358,7 +3370,7 @@
           </w:tcPr>
           <w:p>
             <w:r>
-              <w:t>Uma tabela do Word virou cabeçalhos repetidos ou campos desalinhados</w:t>
+              <w:t>Responsáveis aparecem como cartões soltos</w:t>
             </w:r>
           </w:p>
         </w:tc>
@@ -3374,7 +3386,7 @@
           </w:tcPr>
           <w:p>
             <w:r>
-              <w:t>Execute Ferramentas DOCX &gt; Localizar campos novamente. Use Grade do documento para formulários com rótulo e campo na mesma célula; reserve Tabela de registros para estruturas com cabeçalho e várias linhas.</w:t>
+              <w:t>Use Layout = Tabela e configure o mesmo grupo, linha e colunas, ou reorganize as tags em uma tabela do Word.</w:t>
             </w:r>
           </w:p>
         </w:tc>
@@ -3521,9 +3533,11 @@
         <w:rPr>
           <w:b/>
         </w:rPr>
-        <w:t>☐ Formulários montados em tabelas do Word aparecem como Grade do documento; registros com cabeçalho aparecem como Tabela de registros.</w:t>
+        <w:t xml:space="preserve">☐ </w:t>
       </w:r>
-      <w:r/>
+      <w:r>
+        <w:t>Campos fixos de responsáveis aparecem em tabela.</w:t>
+      </w:r>
     </w:p>
     <w:p>
       <w:pPr>
@@ -3605,9 +3619,15 @@
           </w:tcPr>
           <w:p>
             <w:r>
+              <w:rPr>
+                <w:b/>
+                <w:color w:val="1D5F91"/>
+              </w:rPr>
               <w:t>Resultado esperado</w:t>
               <w:br/>
-              <w:t>O formulário deve seguir a mesma lógica do documento: títulos viram seções, alternativas viram um grupo de escolha, tabelas usadas para alinhamento viram Grade do documento e estruturas tabulares reais viram Tabela de registros.</w:t>
+            </w:r>
+            <w:r>
+              <w:t>O formulário deve seguir a mesma lógica do documento: títulos viram seções, alternativas viram um grupo de escolha e tabelas do Word viram tabelas de preenchimento.</w:t>
             </w:r>
           </w:p>
         </w:tc>

</xml_diff>